<commit_message>
feat(tfl): add "Any treatment-emergent AE" header row to T-AE-02
The shell annotates an overall "Any TEAE (header)" row that the
program never produced. Added above the SOC/PT hierarchy as a section
row: 225 (100.0%) torivumab vs 223 (99.6%) placebo, counting distinct
subjects with >= 1 TEAE and deliberately not restricted by the >= 5%
Preferred Term filter — stated in a new footnote so the row is not
read as a subtotal of the PTs below it.

The completion message subtracts this row from the section count so
it keeps reporting SOC count rather than SOC count + 1.

Regenerated T-AE-01 and T-AE-02 in all formats.

Co-Authored-By: Claude Opus 5 (1M context) <noreply@anthropic.com>
</commit_message>
<xml_diff>
--- a/tfl/tables/T-AE-01.docx
+++ b/tfl/tables/T-AE-01.docx
@@ -2038,6 +2038,681 @@
         <w:tc>
           <w:tcPr>
             <w:tcBorders>
+              <w:bottom w:val="single" w:sz="3" w:space="0" w:color="CCCCCC"/>
+              <w:top w:val="single" w:sz="3" w:space="0" w:color="CCCCCC"/>
+              <w:left w:val="single" w:sz="8" w:space="0" w:color="666666"/>
+              <w:right w:val="single" w:sz="3" w:space="0" w:color="CCCCCC"/>
+            </w:tcBorders>
+            <w:shd w:val="clear" w:color="auto" w:fill="FFFFFF"/>
+            <w:tcMar>
+              <w:top w:w="0" w:type="dxa"/>
+              <w:bottom w:w="0" w:type="dxa"/>
+              <w:left w:w="0" w:type="dxa"/>
+              <w:right w:w="0" w:type="dxa"/>
+            </w:tcMar>
+            <w:vAlign w:val="center"/>
+          </w:tcPr>
+          <w:p>
+            <w:pPr>
+              <w:pStyle w:val="Normal"/>
+              <w:jc w:val="left"/>
+              <w:pBdr>
+                <w:bottom w:val="none" w:sz="0" w:space="0" w:color="000000"/>
+                <w:top w:val="none" w:sz="0" w:space="0" w:color="000000"/>
+                <w:left w:val="none" w:sz="0" w:space="0" w:color="000000"/>
+                <w:right w:val="none" w:sz="0" w:space="0" w:color="000000"/>
+              </w:pBdr>
+              <w:spacing w:after="40" w:before="40" w:line="240"/>
+              <w:ind w:left="300" w:right="100" w:firstLine="0" w:firstLineChars="0"/>
+              <w:rPr>
+                <w:rFonts w:ascii="Arial" w:hAnsi="Arial" w:eastAsia="Arial" w:cs="Arial"/>
+                <w:i w:val="false"/>
+                <w:b w:val="false"/>
+                <w:u w:val="none"/>
+                <w:strike w:val="false"/>
+                <w:sz w:val="18"/>
+                <w:szCs w:val="18"/>
+                <w:color w:val="000000"/>
+              </w:rPr>
+            </w:pPr>
+            <w:r>
+              <w:rPr>
+                <w:rFonts w:ascii="Arial" w:hAnsi="Arial" w:eastAsia="Arial" w:cs="Arial"/>
+                <w:i w:val="false"/>
+                <w:b w:val="false"/>
+                <w:u w:val="none"/>
+                <w:strike w:val="false"/>
+                <w:sz w:val="18"/>
+                <w:szCs w:val="18"/>
+                <w:color w:val="000000"/>
+              </w:rPr>
+              <w:t xml:space="preserve">  TEAE leading to dose modification</w:t>
+            </w:r>
+          </w:p>
+        </w:tc>
+        <w:tc>
+          <w:tcPr>
+            <w:tcBorders>
+              <w:bottom w:val="single" w:sz="3" w:space="0" w:color="CCCCCC"/>
+              <w:top w:val="single" w:sz="3" w:space="0" w:color="CCCCCC"/>
+              <w:left w:val="single" w:sz="3" w:space="0" w:color="CCCCCC"/>
+              <w:right w:val="single" w:sz="3" w:space="0" w:color="CCCCCC"/>
+            </w:tcBorders>
+            <w:shd w:val="clear" w:color="auto" w:fill="FFFFFF"/>
+            <w:tcMar>
+              <w:top w:w="0" w:type="dxa"/>
+              <w:bottom w:w="0" w:type="dxa"/>
+              <w:left w:w="0" w:type="dxa"/>
+              <w:right w:w="0" w:type="dxa"/>
+            </w:tcMar>
+            <w:vAlign w:val="center"/>
+          </w:tcPr>
+          <w:p>
+            <w:pPr>
+              <w:pStyle w:val="Normal"/>
+              <w:jc w:val="center"/>
+              <w:pBdr>
+                <w:bottom w:val="none" w:sz="0" w:space="0" w:color="000000"/>
+                <w:top w:val="none" w:sz="0" w:space="0" w:color="000000"/>
+                <w:left w:val="none" w:sz="0" w:space="0" w:color="000000"/>
+                <w:right w:val="none" w:sz="0" w:space="0" w:color="000000"/>
+              </w:pBdr>
+              <w:spacing w:after="40" w:before="40" w:line="240"/>
+              <w:ind w:left="100" w:right="100" w:firstLine="0" w:firstLineChars="0"/>
+              <w:rPr>
+                <w:rFonts w:ascii="Arial" w:hAnsi="Arial" w:eastAsia="Arial" w:cs="Arial"/>
+                <w:i w:val="false"/>
+                <w:b w:val="false"/>
+                <w:u w:val="none"/>
+                <w:strike w:val="false"/>
+                <w:sz w:val="18"/>
+                <w:szCs w:val="18"/>
+                <w:color w:val="000000"/>
+              </w:rPr>
+            </w:pPr>
+            <w:r>
+              <w:rPr>
+                <w:rFonts w:ascii="Arial" w:hAnsi="Arial" w:eastAsia="Arial" w:cs="Arial"/>
+                <w:i w:val="false"/>
+                <w:b w:val="false"/>
+                <w:u w:val="none"/>
+                <w:strike w:val="false"/>
+                <w:sz w:val="18"/>
+                <w:szCs w:val="18"/>
+                <w:color w:val="000000"/>
+              </w:rPr>
+              <w:t xml:space="preserve">212 (94.2)</w:t>
+            </w:r>
+          </w:p>
+        </w:tc>
+        <w:tc>
+          <w:tcPr>
+            <w:tcBorders>
+              <w:bottom w:val="single" w:sz="3" w:space="0" w:color="CCCCCC"/>
+              <w:top w:val="single" w:sz="3" w:space="0" w:color="CCCCCC"/>
+              <w:left w:val="single" w:sz="3" w:space="0" w:color="CCCCCC"/>
+              <w:right w:val="single" w:sz="3" w:space="0" w:color="CCCCCC"/>
+            </w:tcBorders>
+            <w:shd w:val="clear" w:color="auto" w:fill="FFFFFF"/>
+            <w:tcMar>
+              <w:top w:w="0" w:type="dxa"/>
+              <w:bottom w:w="0" w:type="dxa"/>
+              <w:left w:w="0" w:type="dxa"/>
+              <w:right w:w="0" w:type="dxa"/>
+            </w:tcMar>
+            <w:vAlign w:val="center"/>
+          </w:tcPr>
+          <w:p>
+            <w:pPr>
+              <w:pStyle w:val="Normal"/>
+              <w:jc w:val="center"/>
+              <w:pBdr>
+                <w:bottom w:val="none" w:sz="0" w:space="0" w:color="000000"/>
+                <w:top w:val="none" w:sz="0" w:space="0" w:color="000000"/>
+                <w:left w:val="none" w:sz="0" w:space="0" w:color="000000"/>
+                <w:right w:val="none" w:sz="0" w:space="0" w:color="000000"/>
+              </w:pBdr>
+              <w:spacing w:after="40" w:before="40" w:line="240"/>
+              <w:ind w:left="100" w:right="100" w:firstLine="0" w:firstLineChars="0"/>
+              <w:rPr>
+                <w:rFonts w:ascii="Arial" w:hAnsi="Arial" w:eastAsia="Arial" w:cs="Arial"/>
+                <w:i w:val="false"/>
+                <w:b w:val="false"/>
+                <w:u w:val="none"/>
+                <w:strike w:val="false"/>
+                <w:sz w:val="18"/>
+                <w:szCs w:val="18"/>
+                <w:color w:val="000000"/>
+              </w:rPr>
+            </w:pPr>
+            <w:r>
+              <w:rPr>
+                <w:rFonts w:ascii="Arial" w:hAnsi="Arial" w:eastAsia="Arial" w:cs="Arial"/>
+                <w:i w:val="false"/>
+                <w:b w:val="false"/>
+                <w:u w:val="none"/>
+                <w:strike w:val="false"/>
+                <w:sz w:val="18"/>
+                <w:szCs w:val="18"/>
+                <w:color w:val="000000"/>
+              </w:rPr>
+              <w:t xml:space="preserve">206 (92.0)</w:t>
+            </w:r>
+          </w:p>
+        </w:tc>
+        <w:tc>
+          <w:tcPr>
+            <w:tcBorders>
+              <w:bottom w:val="single" w:sz="3" w:space="0" w:color="CCCCCC"/>
+              <w:top w:val="single" w:sz="3" w:space="0" w:color="CCCCCC"/>
+              <w:left w:val="single" w:sz="3" w:space="0" w:color="CCCCCC"/>
+              <w:right w:val="single" w:sz="8" w:space="0" w:color="666666"/>
+            </w:tcBorders>
+            <w:shd w:val="clear" w:color="auto" w:fill="FFFFFF"/>
+            <w:tcMar>
+              <w:top w:w="0" w:type="dxa"/>
+              <w:bottom w:w="0" w:type="dxa"/>
+              <w:left w:w="0" w:type="dxa"/>
+              <w:right w:w="0" w:type="dxa"/>
+            </w:tcMar>
+            <w:vAlign w:val="center"/>
+          </w:tcPr>
+          <w:p>
+            <w:pPr>
+              <w:pStyle w:val="Normal"/>
+              <w:jc w:val="center"/>
+              <w:pBdr>
+                <w:bottom w:val="none" w:sz="0" w:space="0" w:color="000000"/>
+                <w:top w:val="none" w:sz="0" w:space="0" w:color="000000"/>
+                <w:left w:val="none" w:sz="0" w:space="0" w:color="000000"/>
+                <w:right w:val="none" w:sz="0" w:space="0" w:color="000000"/>
+              </w:pBdr>
+              <w:spacing w:after="40" w:before="40" w:line="240"/>
+              <w:ind w:left="100" w:right="100" w:firstLine="0" w:firstLineChars="0"/>
+              <w:rPr>
+                <w:rFonts w:ascii="Arial" w:hAnsi="Arial" w:eastAsia="Arial" w:cs="Arial"/>
+                <w:i w:val="false"/>
+                <w:b w:val="false"/>
+                <w:u w:val="none"/>
+                <w:strike w:val="false"/>
+                <w:sz w:val="18"/>
+                <w:szCs w:val="18"/>
+                <w:color w:val="000000"/>
+              </w:rPr>
+            </w:pPr>
+            <w:r>
+              <w:rPr>
+                <w:rFonts w:ascii="Arial" w:hAnsi="Arial" w:eastAsia="Arial" w:cs="Arial"/>
+                <w:i w:val="false"/>
+                <w:b w:val="false"/>
+                <w:u w:val="none"/>
+                <w:strike w:val="false"/>
+                <w:sz w:val="18"/>
+                <w:szCs w:val="18"/>
+                <w:color w:val="000000"/>
+              </w:rPr>
+              <w:t xml:space="preserve">418 (93.1)</w:t>
+            </w:r>
+          </w:p>
+        </w:tc>
+      </w:tr>
+      <w:tr>
+        <w:trPr>
+          <w:trHeight w:val="360" w:hRule="auto"/>
+        </w:trPr>
+        <w:tc>
+          <w:tcPr>
+            <w:tcBorders>
+              <w:bottom w:val="single" w:sz="3" w:space="0" w:color="CCCCCC"/>
+              <w:top w:val="single" w:sz="3" w:space="0" w:color="CCCCCC"/>
+              <w:left w:val="single" w:sz="8" w:space="0" w:color="666666"/>
+              <w:right w:val="single" w:sz="3" w:space="0" w:color="CCCCCC"/>
+            </w:tcBorders>
+            <w:shd w:val="clear" w:color="auto" w:fill="FFFFFF"/>
+            <w:tcMar>
+              <w:top w:w="0" w:type="dxa"/>
+              <w:bottom w:w="0" w:type="dxa"/>
+              <w:left w:w="0" w:type="dxa"/>
+              <w:right w:w="0" w:type="dxa"/>
+            </w:tcMar>
+            <w:vAlign w:val="center"/>
+          </w:tcPr>
+          <w:p>
+            <w:pPr>
+              <w:pStyle w:val="Normal"/>
+              <w:jc w:val="left"/>
+              <w:pBdr>
+                <w:bottom w:val="none" w:sz="0" w:space="0" w:color="000000"/>
+                <w:top w:val="none" w:sz="0" w:space="0" w:color="000000"/>
+                <w:left w:val="none" w:sz="0" w:space="0" w:color="000000"/>
+                <w:right w:val="none" w:sz="0" w:space="0" w:color="000000"/>
+              </w:pBdr>
+              <w:spacing w:after="40" w:before="40" w:line="240"/>
+              <w:ind w:left="100" w:right="100" w:firstLine="0" w:firstLineChars="0"/>
+              <w:rPr>
+                <w:rFonts w:ascii="Arial" w:hAnsi="Arial" w:eastAsia="Arial" w:cs="Arial"/>
+                <w:i w:val="false"/>
+                <w:b w:val="false"/>
+                <w:u w:val="none"/>
+                <w:strike w:val="false"/>
+                <w:sz w:val="18"/>
+                <w:szCs w:val="18"/>
+                <w:color w:val="000000"/>
+              </w:rPr>
+            </w:pPr>
+            <w:r>
+              <w:rPr>
+                <w:rFonts w:ascii="Arial" w:hAnsi="Arial" w:eastAsia="Arial" w:cs="Arial"/>
+                <w:i w:val="false"/>
+                <w:b w:val="false"/>
+                <w:u w:val="none"/>
+                <w:strike w:val="false"/>
+                <w:sz w:val="18"/>
+                <w:szCs w:val="18"/>
+                <w:color w:val="000000"/>
+              </w:rPr>
+              <w:t xml:space="preserve">Total treatment exposure (patient-years)</w:t>
+            </w:r>
+          </w:p>
+        </w:tc>
+        <w:tc>
+          <w:tcPr>
+            <w:tcBorders>
+              <w:bottom w:val="single" w:sz="3" w:space="0" w:color="CCCCCC"/>
+              <w:top w:val="single" w:sz="3" w:space="0" w:color="CCCCCC"/>
+              <w:left w:val="single" w:sz="3" w:space="0" w:color="CCCCCC"/>
+              <w:right w:val="single" w:sz="3" w:space="0" w:color="CCCCCC"/>
+            </w:tcBorders>
+            <w:shd w:val="clear" w:color="auto" w:fill="FFFFFF"/>
+            <w:tcMar>
+              <w:top w:w="0" w:type="dxa"/>
+              <w:bottom w:w="0" w:type="dxa"/>
+              <w:left w:w="0" w:type="dxa"/>
+              <w:right w:w="0" w:type="dxa"/>
+            </w:tcMar>
+            <w:vAlign w:val="center"/>
+          </w:tcPr>
+          <w:p>
+            <w:pPr>
+              <w:pStyle w:val="Normal"/>
+              <w:jc w:val="center"/>
+              <w:pBdr>
+                <w:bottom w:val="none" w:sz="0" w:space="0" w:color="000000"/>
+                <w:top w:val="none" w:sz="0" w:space="0" w:color="000000"/>
+                <w:left w:val="none" w:sz="0" w:space="0" w:color="000000"/>
+                <w:right w:val="none" w:sz="0" w:space="0" w:color="000000"/>
+              </w:pBdr>
+              <w:spacing w:after="40" w:before="40" w:line="240"/>
+              <w:ind w:left="100" w:right="100" w:firstLine="0" w:firstLineChars="0"/>
+              <w:rPr>
+                <w:rFonts w:ascii="Arial" w:hAnsi="Arial" w:eastAsia="Arial" w:cs="Arial"/>
+                <w:i w:val="false"/>
+                <w:b w:val="false"/>
+                <w:u w:val="none"/>
+                <w:strike w:val="false"/>
+                <w:sz w:val="18"/>
+                <w:szCs w:val="18"/>
+                <w:color w:val="000000"/>
+              </w:rPr>
+            </w:pPr>
+            <w:r>
+              <w:rPr>
+                <w:rFonts w:ascii="Arial" w:hAnsi="Arial" w:eastAsia="Arial" w:cs="Arial"/>
+                <w:i w:val="false"/>
+                <w:b w:val="false"/>
+                <w:u w:val="none"/>
+                <w:strike w:val="false"/>
+                <w:sz w:val="18"/>
+                <w:szCs w:val="18"/>
+                <w:color w:val="000000"/>
+              </w:rPr>
+              <w:t xml:space="preserve">256.2</w:t>
+            </w:r>
+          </w:p>
+        </w:tc>
+        <w:tc>
+          <w:tcPr>
+            <w:tcBorders>
+              <w:bottom w:val="single" w:sz="3" w:space="0" w:color="CCCCCC"/>
+              <w:top w:val="single" w:sz="3" w:space="0" w:color="CCCCCC"/>
+              <w:left w:val="single" w:sz="3" w:space="0" w:color="CCCCCC"/>
+              <w:right w:val="single" w:sz="3" w:space="0" w:color="CCCCCC"/>
+            </w:tcBorders>
+            <w:shd w:val="clear" w:color="auto" w:fill="FFFFFF"/>
+            <w:tcMar>
+              <w:top w:w="0" w:type="dxa"/>
+              <w:bottom w:w="0" w:type="dxa"/>
+              <w:left w:w="0" w:type="dxa"/>
+              <w:right w:w="0" w:type="dxa"/>
+            </w:tcMar>
+            <w:vAlign w:val="center"/>
+          </w:tcPr>
+          <w:p>
+            <w:pPr>
+              <w:pStyle w:val="Normal"/>
+              <w:jc w:val="center"/>
+              <w:pBdr>
+                <w:bottom w:val="none" w:sz="0" w:space="0" w:color="000000"/>
+                <w:top w:val="none" w:sz="0" w:space="0" w:color="000000"/>
+                <w:left w:val="none" w:sz="0" w:space="0" w:color="000000"/>
+                <w:right w:val="none" w:sz="0" w:space="0" w:color="000000"/>
+              </w:pBdr>
+              <w:spacing w:after="40" w:before="40" w:line="240"/>
+              <w:ind w:left="100" w:right="100" w:firstLine="0" w:firstLineChars="0"/>
+              <w:rPr>
+                <w:rFonts w:ascii="Arial" w:hAnsi="Arial" w:eastAsia="Arial" w:cs="Arial"/>
+                <w:i w:val="false"/>
+                <w:b w:val="false"/>
+                <w:u w:val="none"/>
+                <w:strike w:val="false"/>
+                <w:sz w:val="18"/>
+                <w:szCs w:val="18"/>
+                <w:color w:val="000000"/>
+              </w:rPr>
+            </w:pPr>
+            <w:r>
+              <w:rPr>
+                <w:rFonts w:ascii="Arial" w:hAnsi="Arial" w:eastAsia="Arial" w:cs="Arial"/>
+                <w:i w:val="false"/>
+                <w:b w:val="false"/>
+                <w:u w:val="none"/>
+                <w:strike w:val="false"/>
+                <w:sz w:val="18"/>
+                <w:szCs w:val="18"/>
+                <w:color w:val="000000"/>
+              </w:rPr>
+              <w:t xml:space="preserve">198.7</w:t>
+            </w:r>
+          </w:p>
+        </w:tc>
+        <w:tc>
+          <w:tcPr>
+            <w:tcBorders>
+              <w:bottom w:val="single" w:sz="3" w:space="0" w:color="CCCCCC"/>
+              <w:top w:val="single" w:sz="3" w:space="0" w:color="CCCCCC"/>
+              <w:left w:val="single" w:sz="3" w:space="0" w:color="CCCCCC"/>
+              <w:right w:val="single" w:sz="8" w:space="0" w:color="666666"/>
+            </w:tcBorders>
+            <w:shd w:val="clear" w:color="auto" w:fill="FFFFFF"/>
+            <w:tcMar>
+              <w:top w:w="0" w:type="dxa"/>
+              <w:bottom w:w="0" w:type="dxa"/>
+              <w:left w:w="0" w:type="dxa"/>
+              <w:right w:w="0" w:type="dxa"/>
+            </w:tcMar>
+            <w:vAlign w:val="center"/>
+          </w:tcPr>
+          <w:p>
+            <w:pPr>
+              <w:pStyle w:val="Normal"/>
+              <w:jc w:val="center"/>
+              <w:pBdr>
+                <w:bottom w:val="none" w:sz="0" w:space="0" w:color="000000"/>
+                <w:top w:val="none" w:sz="0" w:space="0" w:color="000000"/>
+                <w:left w:val="none" w:sz="0" w:space="0" w:color="000000"/>
+                <w:right w:val="none" w:sz="0" w:space="0" w:color="000000"/>
+              </w:pBdr>
+              <w:spacing w:after="40" w:before="40" w:line="240"/>
+              <w:ind w:left="100" w:right="100" w:firstLine="0" w:firstLineChars="0"/>
+              <w:rPr>
+                <w:rFonts w:ascii="Arial" w:hAnsi="Arial" w:eastAsia="Arial" w:cs="Arial"/>
+                <w:i w:val="false"/>
+                <w:b w:val="false"/>
+                <w:u w:val="none"/>
+                <w:strike w:val="false"/>
+                <w:sz w:val="18"/>
+                <w:szCs w:val="18"/>
+                <w:color w:val="000000"/>
+              </w:rPr>
+            </w:pPr>
+            <w:r>
+              <w:rPr>
+                <w:rFonts w:ascii="Arial" w:hAnsi="Arial" w:eastAsia="Arial" w:cs="Arial"/>
+                <w:i w:val="false"/>
+                <w:b w:val="false"/>
+                <w:u w:val="none"/>
+                <w:strike w:val="false"/>
+                <w:sz w:val="18"/>
+                <w:szCs w:val="18"/>
+                <w:color w:val="000000"/>
+              </w:rPr>
+              <w:t xml:space="preserve">454.9</w:t>
+            </w:r>
+          </w:p>
+        </w:tc>
+      </w:tr>
+      <w:tr>
+        <w:trPr>
+          <w:trHeight w:val="360" w:hRule="auto"/>
+        </w:trPr>
+        <w:tc>
+          <w:tcPr>
+            <w:tcBorders>
+              <w:bottom w:val="single" w:sz="3" w:space="0" w:color="CCCCCC"/>
+              <w:top w:val="single" w:sz="3" w:space="0" w:color="CCCCCC"/>
+              <w:left w:val="single" w:sz="8" w:space="0" w:color="666666"/>
+              <w:right w:val="single" w:sz="3" w:space="0" w:color="CCCCCC"/>
+            </w:tcBorders>
+            <w:shd w:val="clear" w:color="auto" w:fill="FFFFFF"/>
+            <w:tcMar>
+              <w:top w:w="0" w:type="dxa"/>
+              <w:bottom w:w="0" w:type="dxa"/>
+              <w:left w:w="0" w:type="dxa"/>
+              <w:right w:w="0" w:type="dxa"/>
+            </w:tcMar>
+            <w:vAlign w:val="center"/>
+          </w:tcPr>
+          <w:p>
+            <w:pPr>
+              <w:pStyle w:val="Normal"/>
+              <w:jc w:val="left"/>
+              <w:pBdr>
+                <w:bottom w:val="none" w:sz="0" w:space="0" w:color="000000"/>
+                <w:top w:val="none" w:sz="0" w:space="0" w:color="000000"/>
+                <w:left w:val="none" w:sz="0" w:space="0" w:color="000000"/>
+                <w:right w:val="none" w:sz="0" w:space="0" w:color="000000"/>
+              </w:pBdr>
+              <w:spacing w:after="40" w:before="40" w:line="240"/>
+              <w:ind w:left="100" w:right="100" w:firstLine="0" w:firstLineChars="0"/>
+              <w:rPr>
+                <w:rFonts w:ascii="Arial" w:hAnsi="Arial" w:eastAsia="Arial" w:cs="Arial"/>
+                <w:i w:val="false"/>
+                <w:b w:val="false"/>
+                <w:u w:val="none"/>
+                <w:strike w:val="false"/>
+                <w:sz w:val="18"/>
+                <w:szCs w:val="18"/>
+                <w:color w:val="000000"/>
+              </w:rPr>
+            </w:pPr>
+            <w:r>
+              <w:rPr>
+                <w:rFonts w:ascii="Arial" w:hAnsi="Arial" w:eastAsia="Arial" w:cs="Arial"/>
+                <w:i w:val="false"/>
+                <w:b w:val="false"/>
+                <w:u w:val="none"/>
+                <w:strike w:val="false"/>
+                <w:sz w:val="18"/>
+                <w:szCs w:val="18"/>
+                <w:color w:val="000000"/>
+              </w:rPr>
+              <w:t xml:space="preserve">TEAE events (n)</w:t>
+            </w:r>
+          </w:p>
+        </w:tc>
+        <w:tc>
+          <w:tcPr>
+            <w:tcBorders>
+              <w:bottom w:val="single" w:sz="3" w:space="0" w:color="CCCCCC"/>
+              <w:top w:val="single" w:sz="3" w:space="0" w:color="CCCCCC"/>
+              <w:left w:val="single" w:sz="3" w:space="0" w:color="CCCCCC"/>
+              <w:right w:val="single" w:sz="3" w:space="0" w:color="CCCCCC"/>
+            </w:tcBorders>
+            <w:shd w:val="clear" w:color="auto" w:fill="FFFFFF"/>
+            <w:tcMar>
+              <w:top w:w="0" w:type="dxa"/>
+              <w:bottom w:w="0" w:type="dxa"/>
+              <w:left w:w="0" w:type="dxa"/>
+              <w:right w:w="0" w:type="dxa"/>
+            </w:tcMar>
+            <w:vAlign w:val="center"/>
+          </w:tcPr>
+          <w:p>
+            <w:pPr>
+              <w:pStyle w:val="Normal"/>
+              <w:jc w:val="center"/>
+              <w:pBdr>
+                <w:bottom w:val="none" w:sz="0" w:space="0" w:color="000000"/>
+                <w:top w:val="none" w:sz="0" w:space="0" w:color="000000"/>
+                <w:left w:val="none" w:sz="0" w:space="0" w:color="000000"/>
+                <w:right w:val="none" w:sz="0" w:space="0" w:color="000000"/>
+              </w:pBdr>
+              <w:spacing w:after="40" w:before="40" w:line="240"/>
+              <w:ind w:left="100" w:right="100" w:firstLine="0" w:firstLineChars="0"/>
+              <w:rPr>
+                <w:rFonts w:ascii="Arial" w:hAnsi="Arial" w:eastAsia="Arial" w:cs="Arial"/>
+                <w:i w:val="false"/>
+                <w:b w:val="false"/>
+                <w:u w:val="none"/>
+                <w:strike w:val="false"/>
+                <w:sz w:val="18"/>
+                <w:szCs w:val="18"/>
+                <w:color w:val="000000"/>
+              </w:rPr>
+            </w:pPr>
+            <w:r>
+              <w:rPr>
+                <w:rFonts w:ascii="Arial" w:hAnsi="Arial" w:eastAsia="Arial" w:cs="Arial"/>
+                <w:i w:val="false"/>
+                <w:b w:val="false"/>
+                <w:u w:val="none"/>
+                <w:strike w:val="false"/>
+                <w:sz w:val="18"/>
+                <w:szCs w:val="18"/>
+                <w:color w:val="000000"/>
+              </w:rPr>
+              <w:t xml:space="preserve">1,380</w:t>
+            </w:r>
+          </w:p>
+        </w:tc>
+        <w:tc>
+          <w:tcPr>
+            <w:tcBorders>
+              <w:bottom w:val="single" w:sz="3" w:space="0" w:color="CCCCCC"/>
+              <w:top w:val="single" w:sz="3" w:space="0" w:color="CCCCCC"/>
+              <w:left w:val="single" w:sz="3" w:space="0" w:color="CCCCCC"/>
+              <w:right w:val="single" w:sz="3" w:space="0" w:color="CCCCCC"/>
+            </w:tcBorders>
+            <w:shd w:val="clear" w:color="auto" w:fill="FFFFFF"/>
+            <w:tcMar>
+              <w:top w:w="0" w:type="dxa"/>
+              <w:bottom w:w="0" w:type="dxa"/>
+              <w:left w:w="0" w:type="dxa"/>
+              <w:right w:w="0" w:type="dxa"/>
+            </w:tcMar>
+            <w:vAlign w:val="center"/>
+          </w:tcPr>
+          <w:p>
+            <w:pPr>
+              <w:pStyle w:val="Normal"/>
+              <w:jc w:val="center"/>
+              <w:pBdr>
+                <w:bottom w:val="none" w:sz="0" w:space="0" w:color="000000"/>
+                <w:top w:val="none" w:sz="0" w:space="0" w:color="000000"/>
+                <w:left w:val="none" w:sz="0" w:space="0" w:color="000000"/>
+                <w:right w:val="none" w:sz="0" w:space="0" w:color="000000"/>
+              </w:pBdr>
+              <w:spacing w:after="40" w:before="40" w:line="240"/>
+              <w:ind w:left="100" w:right="100" w:firstLine="0" w:firstLineChars="0"/>
+              <w:rPr>
+                <w:rFonts w:ascii="Arial" w:hAnsi="Arial" w:eastAsia="Arial" w:cs="Arial"/>
+                <w:i w:val="false"/>
+                <w:b w:val="false"/>
+                <w:u w:val="none"/>
+                <w:strike w:val="false"/>
+                <w:sz w:val="18"/>
+                <w:szCs w:val="18"/>
+                <w:color w:val="000000"/>
+              </w:rPr>
+            </w:pPr>
+            <w:r>
+              <w:rPr>
+                <w:rFonts w:ascii="Arial" w:hAnsi="Arial" w:eastAsia="Arial" w:cs="Arial"/>
+                <w:i w:val="false"/>
+                <w:b w:val="false"/>
+                <w:u w:val="none"/>
+                <w:strike w:val="false"/>
+                <w:sz w:val="18"/>
+                <w:szCs w:val="18"/>
+                <w:color w:val="000000"/>
+              </w:rPr>
+              <w:t xml:space="preserve">1,293</w:t>
+            </w:r>
+          </w:p>
+        </w:tc>
+        <w:tc>
+          <w:tcPr>
+            <w:tcBorders>
+              <w:bottom w:val="single" w:sz="3" w:space="0" w:color="CCCCCC"/>
+              <w:top w:val="single" w:sz="3" w:space="0" w:color="CCCCCC"/>
+              <w:left w:val="single" w:sz="3" w:space="0" w:color="CCCCCC"/>
+              <w:right w:val="single" w:sz="8" w:space="0" w:color="666666"/>
+            </w:tcBorders>
+            <w:shd w:val="clear" w:color="auto" w:fill="FFFFFF"/>
+            <w:tcMar>
+              <w:top w:w="0" w:type="dxa"/>
+              <w:bottom w:w="0" w:type="dxa"/>
+              <w:left w:w="0" w:type="dxa"/>
+              <w:right w:w="0" w:type="dxa"/>
+            </w:tcMar>
+            <w:vAlign w:val="center"/>
+          </w:tcPr>
+          <w:p>
+            <w:pPr>
+              <w:pStyle w:val="Normal"/>
+              <w:jc w:val="center"/>
+              <w:pBdr>
+                <w:bottom w:val="none" w:sz="0" w:space="0" w:color="000000"/>
+                <w:top w:val="none" w:sz="0" w:space="0" w:color="000000"/>
+                <w:left w:val="none" w:sz="0" w:space="0" w:color="000000"/>
+                <w:right w:val="none" w:sz="0" w:space="0" w:color="000000"/>
+              </w:pBdr>
+              <w:spacing w:after="40" w:before="40" w:line="240"/>
+              <w:ind w:left="100" w:right="100" w:firstLine="0" w:firstLineChars="0"/>
+              <w:rPr>
+                <w:rFonts w:ascii="Arial" w:hAnsi="Arial" w:eastAsia="Arial" w:cs="Arial"/>
+                <w:i w:val="false"/>
+                <w:b w:val="false"/>
+                <w:u w:val="none"/>
+                <w:strike w:val="false"/>
+                <w:sz w:val="18"/>
+                <w:szCs w:val="18"/>
+                <w:color w:val="000000"/>
+              </w:rPr>
+            </w:pPr>
+            <w:r>
+              <w:rPr>
+                <w:rFonts w:ascii="Arial" w:hAnsi="Arial" w:eastAsia="Arial" w:cs="Arial"/>
+                <w:i w:val="false"/>
+                <w:b w:val="false"/>
+                <w:u w:val="none"/>
+                <w:strike w:val="false"/>
+                <w:sz w:val="18"/>
+                <w:szCs w:val="18"/>
+                <w:color w:val="000000"/>
+              </w:rPr>
+              <w:t xml:space="preserve">2,673</w:t>
+            </w:r>
+          </w:p>
+        </w:tc>
+      </w:tr>
+      <w:tr>
+        <w:trPr>
+          <w:trHeight w:val="360" w:hRule="auto"/>
+        </w:trPr>
+        <w:tc>
+          <w:tcPr>
+            <w:tcBorders>
               <w:bottom w:val="single" w:sz="8" w:space="0" w:color="666666"/>
               <w:top w:val="single" w:sz="3" w:space="0" w:color="CCCCCC"/>
               <w:left w:val="single" w:sz="8" w:space="0" w:color="666666"/>
@@ -2063,30 +2738,30 @@
                 <w:right w:val="none" w:sz="0" w:space="0" w:color="000000"/>
               </w:pBdr>
               <w:spacing w:after="40" w:before="40" w:line="240"/>
-              <w:ind w:left="300" w:right="100" w:firstLine="0" w:firstLineChars="0"/>
-              <w:rPr>
-                <w:rFonts w:ascii="Arial" w:hAnsi="Arial" w:eastAsia="Arial" w:cs="Arial"/>
-                <w:i w:val="false"/>
-                <w:b w:val="false"/>
-                <w:u w:val="none"/>
-                <w:strike w:val="false"/>
-                <w:sz w:val="18"/>
-                <w:szCs w:val="18"/>
-                <w:color w:val="000000"/>
-              </w:rPr>
-            </w:pPr>
-            <w:r>
-              <w:rPr>
-                <w:rFonts w:ascii="Arial" w:hAnsi="Arial" w:eastAsia="Arial" w:cs="Arial"/>
-                <w:i w:val="false"/>
-                <w:b w:val="false"/>
-                <w:u w:val="none"/>
-                <w:strike w:val="false"/>
-                <w:sz w:val="18"/>
-                <w:szCs w:val="18"/>
-                <w:color w:val="000000"/>
-              </w:rPr>
-              <w:t xml:space="preserve">  TEAE leading to dose modification</w:t>
+              <w:ind w:left="100" w:right="100" w:firstLine="0" w:firstLineChars="0"/>
+              <w:rPr>
+                <w:rFonts w:ascii="Arial" w:hAnsi="Arial" w:eastAsia="Arial" w:cs="Arial"/>
+                <w:i w:val="false"/>
+                <w:b w:val="false"/>
+                <w:u w:val="none"/>
+                <w:strike w:val="false"/>
+                <w:sz w:val="18"/>
+                <w:szCs w:val="18"/>
+                <w:color w:val="000000"/>
+              </w:rPr>
+            </w:pPr>
+            <w:r>
+              <w:rPr>
+                <w:rFonts w:ascii="Arial" w:hAnsi="Arial" w:eastAsia="Arial" w:cs="Arial"/>
+                <w:i w:val="false"/>
+                <w:b w:val="false"/>
+                <w:u w:val="none"/>
+                <w:strike w:val="false"/>
+                <w:sz w:val="18"/>
+                <w:szCs w:val="18"/>
+                <w:color w:val="000000"/>
+              </w:rPr>
+              <w:t xml:space="preserve">Exposure-adjusted TEAE rate (events per 100 patient-years)</w:t>
             </w:r>
           </w:p>
         </w:tc>
@@ -2141,7 +2816,7 @@
                 <w:szCs w:val="18"/>
                 <w:color w:val="000000"/>
               </w:rPr>
-              <w:t xml:space="preserve">212 (94.2)</w:t>
+              <w:t xml:space="preserve">538.6</w:t>
             </w:r>
           </w:p>
         </w:tc>
@@ -2196,7 +2871,7 @@
                 <w:szCs w:val="18"/>
                 <w:color w:val="000000"/>
               </w:rPr>
-              <w:t xml:space="preserve">206 (92.0)</w:t>
+              <w:t xml:space="preserve">650.7</w:t>
             </w:r>
           </w:p>
         </w:tc>
@@ -2251,7 +2926,7 @@
                 <w:szCs w:val="18"/>
                 <w:color w:val="000000"/>
               </w:rPr>
-              <w:t xml:space="preserve">418 (93.1)</w:t>
+              <w:t xml:space="preserve">587.6</w:t>
             </w:r>
           </w:p>
         </w:tc>
@@ -2366,6 +3041,32 @@
           <w:szCs w:val="16"/>
           <w:color w:val="000000"/>
         </w:rPr>
+        <w:t xml:space="preserve">Exposure-adjusted TEAE rate = TEAE events / total treatment exposure × 100, where exposure (patient-years) = ADSL.TRTDURD (TRTEDT − TRTSDT + 1) summed across the safety population and divided by 365.25. Numerator counts events, not subjects, so a subject with multiple events contributes more than once (SAP §5.5; estimand S2).</w:t>
+      </w:r>
+    </w:p>
+    <w:p>
+      <w:pPr>
+        <w:jc w:val="left"/>
+        <w:pBdr>
+          <w:bottom w:val="none" w:sz="0" w:space="0" w:color="000000"/>
+          <w:top w:val="none" w:sz="0" w:space="0" w:color="000000"/>
+          <w:left w:val="none" w:sz="0" w:space="0" w:color="000000"/>
+          <w:right w:val="none" w:sz="0" w:space="0" w:color="000000"/>
+        </w:pBdr>
+        <w:spacing w:after="0" w:before="0" w:line="240"/>
+        <w:ind w:left="0" w:right="0" w:firstLine="0" w:firstLineChars="0"/>
+      </w:pPr>
+      <w:r>
+        <w:rPr>
+          <w:rFonts w:ascii="Arial" w:hAnsi="Arial" w:eastAsia="Arial" w:cs="Arial"/>
+          <w:i w:val="false"/>
+          <w:b w:val="false"/>
+          <w:u w:val="none"/>
+          <w:strike w:val="false"/>
+          <w:sz w:val="16"/>
+          <w:szCs w:val="16"/>
+          <w:color w:val="000000"/>
+        </w:rPr>
         <w:t xml:space="preserve">Source: datasets/adam/adae.parquet, adsl.parquet.</w:t>
       </w:r>
     </w:p>
@@ -2392,7 +3093,7 @@
           <w:szCs w:val="14"/>
           <w:color w:val="C0392B"/>
         </w:rPr>
-        <w:t xml:space="preserve">DRAFT — produced 2026-07-19 — synthetic data, NOT for regulatory submission</w:t>
+        <w:t xml:space="preserve">DRAFT — produced 2026-09-20 — synthetic data, NOT for regulatory submission</w:t>
       </w:r>
     </w:p>
     <w:sectPr>

</xml_diff>